<commit_message>
Feat : Started stability analysis
</commit_message>
<xml_diff>
--- a/MCOT.docx
+++ b/MCOT.docx
@@ -45,7 +45,7 @@
           <w:szCs w:val="32"/>
           <w:lang w:val="fr-FR"/>
         </w:rPr>
-        <w:t xml:space="preserve">tabilité des points Lagrange </w:t>
+        <w:t>tabilité des points Lagrange</w:t>
       </w:r>
       <w:r>
         <w:rPr>
@@ -56,7 +56,40 @@
           <w:szCs w:val="32"/>
           <w:lang w:val="fr-FR"/>
         </w:rPr>
-        <w:t>les orbites Halo</w:t>
+        <w:t xml:space="preserve"> et</w:t>
+      </w:r>
+      <w:r>
+        <w:rPr>
+          <w:rFonts w:ascii="Times New Roman" w:hAnsi="Times New Roman" w:cs="Times New Roman"/>
+          <w:b/>
+          <w:bCs/>
+          <w:sz w:val="32"/>
+          <w:szCs w:val="32"/>
+          <w:lang w:val="fr-FR"/>
+        </w:rPr>
+        <w:t xml:space="preserve"> </w:t>
+      </w:r>
+      <w:r>
+        <w:rPr>
+          <w:rFonts w:ascii="Times New Roman" w:hAnsi="Times New Roman" w:cs="Times New Roman"/>
+          <w:b/>
+          <w:bCs/>
+          <w:sz w:val="32"/>
+          <w:szCs w:val="32"/>
+          <w:lang w:val="fr-FR"/>
+        </w:rPr>
+        <w:t xml:space="preserve">les orbites </w:t>
+      </w:r>
+      <w:r>
+        <w:rPr>
+          <w:rFonts w:ascii="Times New Roman" w:hAnsi="Times New Roman" w:cs="Times New Roman"/>
+          <w:b/>
+          <w:bCs/>
+          <w:sz w:val="32"/>
+          <w:szCs w:val="32"/>
+          <w:lang w:val="fr-FR"/>
+        </w:rPr>
+        <w:t>de Lyapunov</w:t>
       </w:r>
     </w:p>
     <w:p>
@@ -337,16 +370,12 @@
         <w:jc w:val="both"/>
         <w:rPr>
           <w:rFonts w:ascii="Times New Roman" w:hAnsi="Times New Roman" w:cs="Times New Roman"/>
-          <w:sz w:val="28"/>
-          <w:szCs w:val="28"/>
-          <w:lang w:val="fr-FR"/>
-        </w:rPr>
-      </w:pPr>
-      <w:r>
-        <w:rPr>
-          <w:rFonts w:ascii="Times New Roman" w:hAnsi="Times New Roman" w:cs="Times New Roman"/>
-          <w:sz w:val="28"/>
-          <w:szCs w:val="28"/>
+          <w:lang w:val="fr-FR"/>
+        </w:rPr>
+      </w:pPr>
+      <w:r>
+        <w:rPr>
+          <w:rFonts w:ascii="Times New Roman" w:hAnsi="Times New Roman" w:cs="Times New Roman"/>
           <w:lang w:val="fr-FR"/>
         </w:rPr>
         <w:t>ABDELOUAHAB Yannis</w:t>
@@ -362,16 +391,12 @@
         <w:jc w:val="both"/>
         <w:rPr>
           <w:rFonts w:ascii="Times New Roman" w:hAnsi="Times New Roman" w:cs="Times New Roman"/>
-          <w:sz w:val="28"/>
-          <w:szCs w:val="28"/>
-          <w:lang w:val="fr-FR"/>
-        </w:rPr>
-      </w:pPr>
-      <w:r>
-        <w:rPr>
-          <w:rFonts w:ascii="Times New Roman" w:hAnsi="Times New Roman" w:cs="Times New Roman"/>
-          <w:sz w:val="28"/>
-          <w:szCs w:val="28"/>
+          <w:lang w:val="fr-FR"/>
+        </w:rPr>
+      </w:pPr>
+      <w:r>
+        <w:rPr>
+          <w:rFonts w:ascii="Times New Roman" w:hAnsi="Times New Roman" w:cs="Times New Roman"/>
           <w:lang w:val="fr-FR"/>
         </w:rPr>
         <w:t>DUPLOUY Paul-Emmanuel</w:t>
@@ -419,43 +444,26 @@
         <w:jc w:val="both"/>
         <w:rPr>
           <w:rFonts w:ascii="Times New Roman" w:hAnsi="Times New Roman" w:cs="Times New Roman"/>
+          <w:lang w:val="fr-FR"/>
+        </w:rPr>
+      </w:pPr>
+      <w:r>
+        <w:rPr>
+          <w:rFonts w:ascii="Times New Roman" w:hAnsi="Times New Roman" w:cs="Times New Roman"/>
           <w:i/>
           <w:iCs/>
-          <w:sz w:val="28"/>
-          <w:szCs w:val="28"/>
-          <w:lang w:val="fr-FR"/>
-        </w:rPr>
-      </w:pPr>
-      <w:r>
-        <w:rPr>
-          <w:rFonts w:ascii="Times New Roman" w:hAnsi="Times New Roman" w:cs="Times New Roman"/>
-          <w:sz w:val="28"/>
-          <w:szCs w:val="28"/>
-          <w:lang w:val="fr-FR"/>
-        </w:rPr>
-        <w:tab/>
+          <w:lang w:val="fr-FR"/>
+        </w:rPr>
+        <w:t>MATHEMATIQUES (Algèbre), PHYSIQUE (Mécanique), INFORMATIQUE (Informatique Appliquée)</w:t>
       </w:r>
       <w:r>
         <w:rPr>
           <w:rFonts w:ascii="Times New Roman" w:hAnsi="Times New Roman" w:cs="Times New Roman"/>
           <w:i/>
           <w:iCs/>
-          <w:sz w:val="28"/>
-          <w:szCs w:val="28"/>
-          <w:lang w:val="fr-FR"/>
-        </w:rPr>
-        <w:t>MATHEMATIQUES (</w:t>
-      </w:r>
-      <w:r>
-        <w:rPr>
-          <w:rFonts w:ascii="Times New Roman" w:hAnsi="Times New Roman" w:cs="Times New Roman"/>
-          <w:i/>
-          <w:iCs/>
-          <w:sz w:val="28"/>
-          <w:szCs w:val="28"/>
-          <w:lang w:val="fr-FR"/>
-        </w:rPr>
-        <w:t>Algèbre), PHYSIQUE (Mécanique), INFORMATIQUE (Informatique Appliquée)</w:t>
+          <w:lang w:val="fr-FR"/>
+        </w:rPr>
+        <w:t>.</w:t>
       </w:r>
     </w:p>
     <w:p>
@@ -474,71 +482,309 @@
         <w:jc w:val="both"/>
         <w:rPr>
           <w:rFonts w:ascii="Times New Roman" w:hAnsi="Times New Roman" w:cs="Times New Roman"/>
-          <w:sz w:val="28"/>
-          <w:szCs w:val="28"/>
-          <w:lang w:val="fr-FR"/>
-        </w:rPr>
-      </w:pPr>
-      <w:r>
-        <w:rPr>
-          <w:rFonts w:ascii="Times New Roman" w:hAnsi="Times New Roman" w:cs="Times New Roman"/>
-          <w:sz w:val="28"/>
-          <w:szCs w:val="28"/>
-          <w:lang w:val="fr-FR"/>
-        </w:rPr>
-        <w:t>(</w:t>
-      </w:r>
-      <w:r>
-        <w:rPr>
-          <w:rFonts w:ascii="Times New Roman" w:hAnsi="Times New Roman" w:cs="Times New Roman"/>
-          <w:sz w:val="28"/>
-          <w:szCs w:val="28"/>
-          <w:lang w:val="fr-FR"/>
-        </w:rPr>
-        <w:t>*</w:t>
-      </w:r>
-      <w:r>
-        <w:rPr>
-          <w:rFonts w:ascii="Times New Roman" w:hAnsi="Times New Roman" w:cs="Times New Roman"/>
-          <w:i/>
-          <w:iCs/>
-          <w:sz w:val="28"/>
-          <w:szCs w:val="28"/>
-          <w:lang w:val="fr-FR"/>
-        </w:rPr>
-        <w:t xml:space="preserve">CE DERNIER POINT FAIT REF A L’IDEE DE RAJOUTER DU BRUIT SUR UNE TRAJECTOIRE POUR ETUDIER SON EVOLUTION </w:t>
-      </w:r>
-      <w:r>
-        <w:rPr>
-          <w:rFonts w:ascii="Times New Roman" w:hAnsi="Times New Roman" w:cs="Times New Roman"/>
-          <w:i/>
-          <w:iCs/>
-          <w:sz w:val="28"/>
-          <w:szCs w:val="28"/>
-          <w:lang w:val="fr-FR"/>
-        </w:rPr>
-        <w:sym w:font="Wingdings" w:char="F0E0"/>
-      </w:r>
-      <w:r>
-        <w:rPr>
-          <w:rFonts w:ascii="Times New Roman" w:hAnsi="Times New Roman" w:cs="Times New Roman"/>
-          <w:i/>
-          <w:iCs/>
-          <w:sz w:val="28"/>
-          <w:szCs w:val="28"/>
-          <w:lang w:val="fr-FR"/>
-        </w:rPr>
-        <w:t xml:space="preserve"> SIMULATION DES FORCES ATTRACTIVES D’AUTRES CORPS DU SYSTEME</w:t>
-      </w:r>
-      <w:r>
-        <w:rPr>
-          <w:rFonts w:ascii="Times New Roman" w:hAnsi="Times New Roman" w:cs="Times New Roman"/>
-          <w:sz w:val="28"/>
-          <w:szCs w:val="28"/>
-          <w:lang w:val="fr-FR"/>
-        </w:rPr>
-        <w:t>)</w:t>
-      </w:r>
+          <w:b/>
+          <w:bCs/>
+          <w:sz w:val="28"/>
+          <w:szCs w:val="28"/>
+          <w:lang w:val="fr-FR"/>
+        </w:rPr>
+      </w:pPr>
+      <w:r>
+        <w:rPr>
+          <w:rFonts w:ascii="Times New Roman" w:hAnsi="Times New Roman" w:cs="Times New Roman"/>
+          <w:b/>
+          <w:bCs/>
+          <w:sz w:val="28"/>
+          <w:szCs w:val="28"/>
+          <w:lang w:val="fr-FR"/>
+        </w:rPr>
+        <w:t>Mots-clés</w:t>
+      </w:r>
+    </w:p>
+    <w:tbl>
+      <w:tblPr>
+        <w:tblStyle w:val="TableGrid"/>
+        <w:tblW w:w="0" w:type="auto"/>
+        <w:tblBorders>
+          <w:top w:val="single" w:sz="4" w:space="0" w:color="FFFFFF" w:themeColor="background1"/>
+          <w:left w:val="single" w:sz="4" w:space="0" w:color="FFFFFF" w:themeColor="background1"/>
+          <w:bottom w:val="single" w:sz="4" w:space="0" w:color="FFFFFF" w:themeColor="background1"/>
+          <w:right w:val="single" w:sz="4" w:space="0" w:color="FFFFFF" w:themeColor="background1"/>
+        </w:tblBorders>
+        <w:tblLook w:val="04A0" w:firstRow="1" w:lastRow="0" w:firstColumn="1" w:lastColumn="0" w:noHBand="0" w:noVBand="1"/>
+      </w:tblPr>
+      <w:tblGrid>
+        <w:gridCol w:w="4698"/>
+        <w:gridCol w:w="4698"/>
+      </w:tblGrid>
+      <w:tr>
+        <w:tc>
+          <w:tcPr>
+            <w:tcW w:w="4698" w:type="dxa"/>
+          </w:tcPr>
+          <w:p>
+            <w:pPr>
+              <w:jc w:val="both"/>
+              <w:rPr>
+                <w:rFonts w:ascii="Times New Roman" w:hAnsi="Times New Roman" w:cs="Times New Roman"/>
+                <w:lang w:val="fr-FR"/>
+              </w:rPr>
+            </w:pPr>
+            <w:r>
+              <w:rPr>
+                <w:rFonts w:ascii="Times New Roman" w:hAnsi="Times New Roman" w:cs="Times New Roman"/>
+                <w:b/>
+                <w:bCs/>
+                <w:lang w:val="fr-FR"/>
+              </w:rPr>
+              <w:t>Mots-clés</w:t>
+            </w:r>
+            <w:r>
+              <w:rPr>
+                <w:rFonts w:ascii="Times New Roman" w:hAnsi="Times New Roman" w:cs="Times New Roman"/>
+                <w:lang w:val="fr-FR"/>
+              </w:rPr>
+              <w:t xml:space="preserve"> (en français</w:t>
+            </w:r>
+            <w:r>
+              <w:rPr>
+                <w:rFonts w:ascii="Times New Roman" w:hAnsi="Times New Roman" w:cs="Times New Roman"/>
+                <w:lang w:val="fr-FR"/>
+              </w:rPr>
+              <w:t>)</w:t>
+            </w:r>
+          </w:p>
+          <w:p>
+            <w:pPr>
+              <w:jc w:val="both"/>
+              <w:rPr>
+                <w:rFonts w:ascii="Times New Roman" w:hAnsi="Times New Roman" w:cs="Times New Roman"/>
+                <w:i/>
+                <w:iCs/>
+                <w:lang w:val="fr-FR"/>
+              </w:rPr>
+            </w:pPr>
+            <w:r>
+              <w:rPr>
+                <w:rFonts w:ascii="Times New Roman" w:hAnsi="Times New Roman" w:cs="Times New Roman"/>
+                <w:i/>
+                <w:iCs/>
+                <w:lang w:val="fr-FR"/>
+              </w:rPr>
+              <w:t>Problème à Trois Corps</w:t>
+            </w:r>
+          </w:p>
+          <w:p>
+            <w:pPr>
+              <w:jc w:val="both"/>
+              <w:rPr>
+                <w:rFonts w:ascii="Times New Roman" w:hAnsi="Times New Roman" w:cs="Times New Roman"/>
+                <w:i/>
+                <w:iCs/>
+                <w:lang w:val="fr-FR"/>
+              </w:rPr>
+            </w:pPr>
+            <w:r>
+              <w:rPr>
+                <w:rFonts w:ascii="Times New Roman" w:hAnsi="Times New Roman" w:cs="Times New Roman"/>
+                <w:i/>
+                <w:iCs/>
+                <w:lang w:val="fr-FR"/>
+              </w:rPr>
+              <w:t>Théorème d</w:t>
+            </w:r>
+            <w:r>
+              <w:rPr>
+                <w:rFonts w:ascii="Times New Roman" w:hAnsi="Times New Roman" w:cs="Times New Roman"/>
+                <w:i/>
+                <w:iCs/>
+                <w:lang w:val="fr-FR"/>
+              </w:rPr>
+              <w:t>u centre de Lyapunov</w:t>
+            </w:r>
+          </w:p>
+          <w:p>
+            <w:pPr>
+              <w:jc w:val="both"/>
+              <w:rPr>
+                <w:rFonts w:ascii="Times New Roman" w:hAnsi="Times New Roman" w:cs="Times New Roman"/>
+                <w:i/>
+                <w:iCs/>
+                <w:lang w:val="fr-FR"/>
+              </w:rPr>
+            </w:pPr>
+            <w:r>
+              <w:rPr>
+                <w:rFonts w:ascii="Times New Roman" w:hAnsi="Times New Roman" w:cs="Times New Roman"/>
+                <w:i/>
+                <w:iCs/>
+                <w:lang w:val="fr-FR"/>
+              </w:rPr>
+              <w:t>Stabilité</w:t>
+            </w:r>
+          </w:p>
+          <w:p>
+            <w:pPr>
+              <w:jc w:val="both"/>
+              <w:rPr>
+                <w:rFonts w:ascii="Times New Roman" w:hAnsi="Times New Roman" w:cs="Times New Roman"/>
+                <w:lang w:val="fr-FR"/>
+              </w:rPr>
+            </w:pPr>
+            <w:r>
+              <w:rPr>
+                <w:rFonts w:ascii="Times New Roman" w:hAnsi="Times New Roman" w:cs="Times New Roman"/>
+                <w:i/>
+                <w:iCs/>
+                <w:lang w:val="fr-FR"/>
+              </w:rPr>
+              <w:t>Intégration numérique</w:t>
+            </w:r>
+          </w:p>
+        </w:tc>
+        <w:tc>
+          <w:tcPr>
+            <w:tcW w:w="4698" w:type="dxa"/>
+          </w:tcPr>
+          <w:p>
+            <w:pPr>
+              <w:jc w:val="both"/>
+              <w:rPr>
+                <w:rFonts w:ascii="Times New Roman" w:hAnsi="Times New Roman" w:cs="Times New Roman"/>
+              </w:rPr>
+            </w:pPr>
+            <w:r>
+              <w:rPr>
+                <w:rFonts w:ascii="Times New Roman" w:hAnsi="Times New Roman" w:cs="Times New Roman"/>
+                <w:b/>
+                <w:bCs/>
+              </w:rPr>
+              <w:t>Mots-</w:t>
+            </w:r>
+            <w:proofErr w:type="spellStart"/>
+            <w:r>
+              <w:rPr>
+                <w:rFonts w:ascii="Times New Roman" w:hAnsi="Times New Roman" w:cs="Times New Roman"/>
+                <w:b/>
+                <w:bCs/>
+              </w:rPr>
+              <w:t>clés</w:t>
+            </w:r>
+            <w:proofErr w:type="spellEnd"/>
+            <w:r>
+              <w:rPr>
+                <w:rFonts w:ascii="Times New Roman" w:hAnsi="Times New Roman" w:cs="Times New Roman"/>
+              </w:rPr>
+              <w:t xml:space="preserve"> (</w:t>
+            </w:r>
+            <w:proofErr w:type="spellStart"/>
+            <w:r>
+              <w:rPr>
+                <w:rFonts w:ascii="Times New Roman" w:hAnsi="Times New Roman" w:cs="Times New Roman"/>
+              </w:rPr>
+              <w:t>en</w:t>
+            </w:r>
+            <w:proofErr w:type="spellEnd"/>
+            <w:r>
+              <w:rPr>
+                <w:rFonts w:ascii="Times New Roman" w:hAnsi="Times New Roman" w:cs="Times New Roman"/>
+              </w:rPr>
+              <w:t xml:space="preserve"> </w:t>
+            </w:r>
+            <w:r>
+              <w:rPr>
+                <w:rFonts w:ascii="Times New Roman" w:hAnsi="Times New Roman" w:cs="Times New Roman"/>
+              </w:rPr>
+              <w:t>anglais)</w:t>
+            </w:r>
+          </w:p>
+          <w:p>
+            <w:pPr>
+              <w:jc w:val="both"/>
+              <w:rPr>
+                <w:rFonts w:ascii="Times New Roman" w:hAnsi="Times New Roman" w:cs="Times New Roman"/>
+                <w:i/>
+                <w:iCs/>
+              </w:rPr>
+            </w:pPr>
+            <w:r>
+              <w:rPr>
+                <w:rFonts w:ascii="Times New Roman" w:hAnsi="Times New Roman" w:cs="Times New Roman"/>
+                <w:i/>
+                <w:iCs/>
+              </w:rPr>
+              <w:t>Three-Body Problem</w:t>
+            </w:r>
+          </w:p>
+          <w:p>
+            <w:pPr>
+              <w:jc w:val="both"/>
+              <w:rPr>
+                <w:rFonts w:ascii="Times New Roman" w:hAnsi="Times New Roman" w:cs="Times New Roman"/>
+                <w:i/>
+                <w:iCs/>
+              </w:rPr>
+            </w:pPr>
+            <w:r>
+              <w:rPr>
+                <w:rFonts w:ascii="Times New Roman" w:hAnsi="Times New Roman" w:cs="Times New Roman"/>
+                <w:i/>
+                <w:iCs/>
+              </w:rPr>
+              <w:t>Lyapunov Center Theorem</w:t>
+            </w:r>
+          </w:p>
+          <w:p>
+            <w:pPr>
+              <w:jc w:val="both"/>
+              <w:rPr>
+                <w:rFonts w:ascii="Times New Roman" w:hAnsi="Times New Roman" w:cs="Times New Roman"/>
+                <w:i/>
+                <w:iCs/>
+              </w:rPr>
+            </w:pPr>
+            <w:r>
+              <w:rPr>
+                <w:rFonts w:ascii="Times New Roman" w:hAnsi="Times New Roman" w:cs="Times New Roman"/>
+                <w:i/>
+                <w:iCs/>
+              </w:rPr>
+              <w:t>Stability</w:t>
+            </w:r>
+          </w:p>
+          <w:p>
+            <w:pPr>
+              <w:jc w:val="both"/>
+              <w:rPr>
+                <w:rFonts w:ascii="Times New Roman" w:hAnsi="Times New Roman" w:cs="Times New Roman"/>
+              </w:rPr>
+            </w:pPr>
+            <w:r>
+              <w:rPr>
+                <w:rFonts w:ascii="Times New Roman" w:hAnsi="Times New Roman" w:cs="Times New Roman"/>
+                <w:i/>
+                <w:iCs/>
+              </w:rPr>
+              <w:t>Numerical Integration</w:t>
+            </w:r>
+          </w:p>
+        </w:tc>
+      </w:tr>
+    </w:tbl>
+    <w:p>
+      <w:pPr>
+        <w:jc w:val="both"/>
+      </w:pPr>
+    </w:p>
+    <w:p>
+      <w:pPr>
+        <w:jc w:val="both"/>
+        <w:rPr>
+          <w:rFonts w:ascii="Times New Roman" w:hAnsi="Times New Roman" w:cs="Times New Roman"/>
+          <w:sz w:val="28"/>
+          <w:szCs w:val="28"/>
+        </w:rPr>
+      </w:pPr>
     </w:p>
     <w:sectPr>
       <w:pgSz w:w="12240" w:h="15840"/>
@@ -1586,6 +1832,25 @@
       <w:spacing w:val="5"/>
     </w:rPr>
   </w:style>
+  <w:style w:type="table" w:styleId="TableGrid">
+    <w:name w:val="Table Grid"/>
+    <w:basedOn w:val="TableNormal"/>
+    <w:uiPriority w:val="39"/>
+    <w:rsid w:val="00D3331E"/>
+    <w:pPr>
+      <w:spacing w:after="0" w:line="240" w:lineRule="auto"/>
+    </w:pPr>
+    <w:tblPr>
+      <w:tblBorders>
+        <w:top w:val="single" w:sz="4" w:space="0" w:color="auto"/>
+        <w:left w:val="single" w:sz="4" w:space="0" w:color="auto"/>
+        <w:bottom w:val="single" w:sz="4" w:space="0" w:color="auto"/>
+        <w:right w:val="single" w:sz="4" w:space="0" w:color="auto"/>
+        <w:insideH w:val="single" w:sz="4" w:space="0" w:color="auto"/>
+        <w:insideV w:val="single" w:sz="4" w:space="0" w:color="auto"/>
+      </w:tblBorders>
+    </w:tblPr>
+  </w:style>
 </w:styles>
 </file>
 

</xml_diff>